<commit_message>
feat(install): PowerShell 한 줄 설치기 install.ps1 — irm …/install.ps1 | iex
새 컴퓨터에서 붙여넣기 한 줄로 끝나게: Python 3.11+·Git 확인(없으면 winget, 스토어 stub 은 제외)
→ $HOME\inframon 에 clone(이미 있으면 pull; git 없으면 zip) → python start.py --full --dashboard.
PS 5.1 에서 git 의 stderr 진행률이 "Stop" 오류로 스크립트를 죽이는 것을 겪어 Continue + 종료코드
확인으로 바꿨다. 로컬에서 빈 폴더 → 대시보드 200 까지 확인. README·시작하기·혼자 돌리기(10쪽) 첫머리에
같은 한 줄.

Co-Authored-By: Claude Code <noreply@anthropic.com>
Claude-Session: https://claude.ai/code/session_01V1cBHBHuZPr2N6tmJ7Lg3x
</commit_message>
<xml_diff>
--- a/docs/inframon_혼자_돌리기.docx
+++ b/docs/inframon_혼자_돌리기.docx
@@ -39,7 +39,7 @@
         </w:rPr>
         <w:t>이 프로그램은 Python 으로 혼자 돕니다. Claude 나 다른 AI 는 필요 없습니다.</w:t>
         <w:br/>
-        <w:t>아래 순서대로 한 줄씩 치고, 각 단계의 '확인 ☐' 이 맞으면 다음으로 갑니다.</w:t>
+        <w:t>PowerShell 에 한 줄만 붙여넣으면 대시보드까지 열립니다. 그 뒤는 화면에서 누르는 순서대로.</w:t>
       </w:r>
     </w:p>
     <w:p>
@@ -53,7 +53,319 @@
           <w:color w:val="777777"/>
           <w:sz w:val="20"/>
         </w:rPr>
-        <w:t>2026-09-08 · https://github.com/tjddnr8334-sudo/inframon</w:t>
+        <w:t>2026-09-09 · https://github.com/tjddnr8334-sudo/inframon</w:t>
+      </w:r>
+    </w:p>
+    <w:p>
+      <w:r>
+        <w:br w:type="page"/>
+      </w:r>
+    </w:p>
+    <w:p>
+      <w:pPr>
+        <w:pStyle w:val="Heading1"/>
+      </w:pPr>
+      <w:r>
+        <w:rPr>
+          <w:rFonts w:ascii="맑은 고딕" w:hAnsi="맑은 고딕" w:eastAsia="맑은 고딕"/>
+          <w:b/>
+          <w:color w:val="1F3A5F"/>
+          <w:sz w:val="32"/>
+        </w:rPr>
+        <w:t>가장 쉬운 길 — PowerShell 에 한 줄 붙여넣기</w:t>
+      </w:r>
+    </w:p>
+    <w:p>
+      <w:pPr>
+        <w:spacing w:after="120"/>
+      </w:pPr>
+      <w:r>
+        <w:rPr>
+          <w:rFonts w:ascii="맑은 고딕" w:hAnsi="맑은 고딕" w:eastAsia="맑은 고딕"/>
+          <w:b w:val="0"/>
+          <w:sz w:val="21"/>
+        </w:rPr>
+        <w:t xml:space="preserve">키보드 </w:t>
+      </w:r>
+      <w:r>
+        <w:rPr>
+          <w:rFonts w:ascii="맑은 고딕" w:hAnsi="맑은 고딕" w:eastAsia="맑은 고딕"/>
+          <w:b/>
+          <w:sz w:val="21"/>
+        </w:rPr>
+        <w:t>Win + X</w:t>
+      </w:r>
+      <w:r>
+        <w:rPr>
+          <w:rFonts w:ascii="맑은 고딕" w:hAnsi="맑은 고딕" w:eastAsia="맑은 고딕"/>
+          <w:b w:val="0"/>
+          <w:sz w:val="21"/>
+        </w:rPr>
+        <w:t xml:space="preserve"> → </w:t>
+      </w:r>
+      <w:r>
+        <w:rPr>
+          <w:rFonts w:ascii="맑은 고딕" w:hAnsi="맑은 고딕" w:eastAsia="맑은 고딕"/>
+          <w:b/>
+          <w:sz w:val="21"/>
+        </w:rPr>
+        <w:t>터미널</w:t>
+      </w:r>
+      <w:r>
+        <w:rPr>
+          <w:rFonts w:ascii="맑은 고딕" w:hAnsi="맑은 고딕" w:eastAsia="맑은 고딕"/>
+          <w:b w:val="0"/>
+          <w:sz w:val="21"/>
+        </w:rPr>
+        <w:t xml:space="preserve"> 을 열고, 아래 한 줄을 그대로 붙여넣고 Enter. 이것으로 0~3 절이 전부 자동입니다.</w:t>
+      </w:r>
+    </w:p>
+    <w:p>
+      <w:pPr>
+        <w:spacing w:after="160"/>
+        <w:ind w:left="340"/>
+        <w:shd w:val="clear" w:color="auto" w:fill="EEF2F7"/>
+      </w:pPr>
+      <w:r>
+        <w:rPr>
+          <w:rFonts w:ascii="Consolas" w:hAnsi="Consolas" w:eastAsia="Consolas"/>
+          <w:b w:val="0"/>
+          <w:color w:val="1B2631"/>
+          <w:sz w:val="20"/>
+        </w:rPr>
+        <w:t>irm https://raw.githubusercontent.com/tjddnr8334-sudo/inframon/main/install.ps1 | iex</w:t>
+      </w:r>
+    </w:p>
+    <w:tbl>
+      <w:tblPr>
+        <w:tblStyle w:val="TableGrid"/>
+        <w:tblW w:type="auto" w:w="0"/>
+        <w:jc w:val="center"/>
+        <w:tblLook w:firstColumn="1" w:firstRow="1" w:lastColumn="0" w:lastRow="0" w:noHBand="0" w:noVBand="1" w:val="04A0"/>
+      </w:tblPr>
+      <w:tblGrid>
+        <w:gridCol w:w="4873"/>
+        <w:gridCol w:w="4873"/>
+      </w:tblGrid>
+      <w:tr>
+        <w:tc>
+          <w:tcPr>
+            <w:tcW w:type="dxa" w:w="6520"/>
+            <w:shd w:val="clear" w:color="auto" w:fill="DCE6F1"/>
+          </w:tcPr>
+          <w:p>
+            <w:r/>
+            <w:r>
+              <w:rPr>
+                <w:rFonts w:ascii="맑은 고딕" w:hAnsi="맑은 고딕" w:eastAsia="맑은 고딕"/>
+                <w:b/>
+                <w:sz w:val="19"/>
+              </w:rPr>
+              <w:t>자동으로 하는 일</w:t>
+            </w:r>
+          </w:p>
+        </w:tc>
+        <w:tc>
+          <w:tcPr>
+            <w:tcW w:type="dxa" w:w="2551"/>
+            <w:shd w:val="clear" w:color="auto" w:fill="DCE6F1"/>
+          </w:tcPr>
+          <w:p>
+            <w:r/>
+            <w:r>
+              <w:rPr>
+                <w:rFonts w:ascii="맑은 고딕" w:hAnsi="맑은 고딕" w:eastAsia="맑은 고딕"/>
+                <w:b/>
+                <w:sz w:val="19"/>
+              </w:rPr>
+              <w:t>걸리는 시간</w:t>
+            </w:r>
+          </w:p>
+        </w:tc>
+      </w:tr>
+      <w:tr>
+        <w:tc>
+          <w:tcPr>
+            <w:tcW w:type="dxa" w:w="6520"/>
+          </w:tcPr>
+          <w:p>
+            <w:r/>
+            <w:r>
+              <w:rPr>
+                <w:rFonts w:ascii="맑은 고딕" w:hAnsi="맑은 고딕" w:eastAsia="맑은 고딕"/>
+                <w:b w:val="0"/>
+                <w:sz w:val="19"/>
+              </w:rPr>
+              <w:t>Python 3.11+ · Git 확인 — 없으면 winget 으로 설치</w:t>
+            </w:r>
+          </w:p>
+        </w:tc>
+        <w:tc>
+          <w:tcPr>
+            <w:tcW w:type="dxa" w:w="2551"/>
+          </w:tcPr>
+          <w:p>
+            <w:r/>
+            <w:r>
+              <w:rPr>
+                <w:rFonts w:ascii="맑은 고딕" w:hAnsi="맑은 고딕" w:eastAsia="맑은 고딕"/>
+                <w:b w:val="0"/>
+                <w:sz w:val="19"/>
+              </w:rPr>
+              <w:t>0~3분</w:t>
+            </w:r>
+          </w:p>
+        </w:tc>
+      </w:tr>
+      <w:tr>
+        <w:tc>
+          <w:tcPr>
+            <w:tcW w:type="dxa" w:w="6520"/>
+          </w:tcPr>
+          <w:p>
+            <w:r/>
+            <w:r>
+              <w:rPr>
+                <w:rFonts w:ascii="맑은 고딕" w:hAnsi="맑은 고딕" w:eastAsia="맑은 고딕"/>
+                <w:b w:val="0"/>
+                <w:sz w:val="19"/>
+              </w:rPr>
+              <w:t xml:space="preserve">GitHub 에서 받기 → 내 사용자 폴더 </w:t>
+            </w:r>
+            <w:r>
+              <w:rPr>
+                <w:rFonts w:ascii="맑은 고딕" w:hAnsi="맑은 고딕" w:eastAsia="맑은 고딕"/>
+                <w:b/>
+                <w:sz w:val="19"/>
+              </w:rPr>
+              <w:t>C:\Users\(이름)\inframon</w:t>
+            </w:r>
+            <w:r>
+              <w:rPr>
+                <w:rFonts w:ascii="맑은 고딕" w:hAnsi="맑은 고딕" w:eastAsia="맑은 고딕"/>
+                <w:b w:val="0"/>
+                <w:sz w:val="19"/>
+              </w:rPr>
+              <w:t xml:space="preserve"> (이미 있으면 최신으로 갱신)</w:t>
+            </w:r>
+          </w:p>
+        </w:tc>
+        <w:tc>
+          <w:tcPr>
+            <w:tcW w:type="dxa" w:w="2551"/>
+          </w:tcPr>
+          <w:p>
+            <w:r/>
+            <w:r>
+              <w:rPr>
+                <w:rFonts w:ascii="맑은 고딕" w:hAnsi="맑은 고딕" w:eastAsia="맑은 고딕"/>
+                <w:b w:val="0"/>
+                <w:sz w:val="19"/>
+              </w:rPr>
+              <w:t>10초</w:t>
+            </w:r>
+          </w:p>
+        </w:tc>
+      </w:tr>
+      <w:tr>
+        <w:tc>
+          <w:tcPr>
+            <w:tcW w:type="dxa" w:w="6520"/>
+          </w:tcPr>
+          <w:p>
+            <w:r/>
+            <w:r>
+              <w:rPr>
+                <w:rFonts w:ascii="맑은 고딕" w:hAnsi="맑은 고딕" w:eastAsia="맑은 고딕"/>
+                <w:b w:val="0"/>
+                <w:sz w:val="19"/>
+              </w:rPr>
+              <w:t xml:space="preserve">필요한 패키지 전부 설치 → 데모 → 진단 → </w:t>
+            </w:r>
+            <w:r>
+              <w:rPr>
+                <w:rFonts w:ascii="맑은 고딕" w:hAnsi="맑은 고딕" w:eastAsia="맑은 고딕"/>
+                <w:b/>
+                <w:sz w:val="19"/>
+              </w:rPr>
+              <w:t>브라우저에 대시보드</w:t>
+            </w:r>
+          </w:p>
+        </w:tc>
+        <w:tc>
+          <w:tcPr>
+            <w:tcW w:type="dxa" w:w="2551"/>
+          </w:tcPr>
+          <w:p>
+            <w:r/>
+            <w:r>
+              <w:rPr>
+                <w:rFonts w:ascii="맑은 고딕" w:hAnsi="맑은 고딕" w:eastAsia="맑은 고딕"/>
+                <w:b w:val="0"/>
+                <w:sz w:val="19"/>
+              </w:rPr>
+              <w:t>5~10분 (처음만)</w:t>
+            </w:r>
+          </w:p>
+        </w:tc>
+      </w:tr>
+    </w:tbl>
+    <w:p>
+      <w:pPr>
+        <w:spacing w:after="80"/>
+      </w:pPr>
+    </w:p>
+    <w:p>
+      <w:pPr>
+        <w:spacing w:after="200"/>
+        <w:ind w:left="340"/>
+      </w:pPr>
+      <w:r>
+        <w:rPr>
+          <w:rFonts w:ascii="맑은 고딕" w:hAnsi="맑은 고딕" w:eastAsia="맑은 고딕"/>
+          <w:b/>
+          <w:color w:val="1E7E34"/>
+          <w:sz w:val="21"/>
+        </w:rPr>
+        <w:t xml:space="preserve">확인 ☐  </w:t>
+      </w:r>
+      <w:r>
+        <w:rPr>
+          <w:rFonts w:ascii="맑은 고딕" w:hAnsi="맑은 고딕" w:eastAsia="맑은 고딕"/>
+          <w:b w:val="0"/>
+          <w:sz w:val="21"/>
+        </w:rPr>
+        <w:t xml:space="preserve">브라우저에 http://localhost:8501 대시보드가 열린다 → </w:t>
+      </w:r>
+      <w:r>
+        <w:rPr>
+          <w:rFonts w:ascii="맑은 고딕" w:hAnsi="맑은 고딕" w:eastAsia="맑은 고딕"/>
+          <w:b/>
+          <w:sz w:val="21"/>
+        </w:rPr>
+        <w:t>4절</w:t>
+      </w:r>
+      <w:r>
+        <w:rPr>
+          <w:rFonts w:ascii="맑은 고딕" w:hAnsi="맑은 고딕" w:eastAsia="맑은 고딕"/>
+          <w:b w:val="0"/>
+          <w:sz w:val="21"/>
+        </w:rPr>
+        <w:t xml:space="preserve"> 로 바로 간다. 끄려면 터미널에서 Ctrl + C, 다시 띄우려면 같은 한 줄을 다시 붙여넣는다.</w:t>
+      </w:r>
+    </w:p>
+    <w:p>
+      <w:pPr>
+        <w:spacing w:after="120"/>
+      </w:pPr>
+      <w:r>
+        <w:rPr>
+          <w:rFonts w:ascii="맑은 고딕" w:hAnsi="맑은 고딕" w:eastAsia="맑은 고딕"/>
+          <w:b w:val="0"/>
+          <w:color w:val="555F6B"/>
+          <w:sz w:val="21"/>
+        </w:rPr>
+        <w:t>이 한 줄이 안 되는 컴퓨터(인터넷 차단, winget 없음)만 아래 0~3 절을 손으로 합니다.</w:t>
       </w:r>
     </w:p>
     <w:p>

</xml_diff>